<commit_message>
Enhance clarity and detail in the DoAc system explanation, including the addition of an abstract and updates to the vowel sign table for improved accuracy.
</commit_message>
<xml_diff>
--- a/manuscripts/english-today-doac/doac-english-today-formatted.docx
+++ b/manuscripts/english-today-doac/doac-english-today-formatted.docx
@@ -82,9 +82,231 @@
           <w:color w:val="1C1C1C"/>
           <w:lang w:val="en"/>
         </w:rPr>
-        <w:pict w14:anchorId="185B93F4">
+        <w:pict w14:anchorId="4565D539">
           <v:rect id="_x0000_i1025" style="width:153.05pt;height:1.5pt" o:hrpct="360" o:hralign="center" o:hrstd="t" o:hr="t" fillcolor="#a0a0a0" stroked="f"/>
         </w:pict>
+      </w:r>
+    </w:p>
+    <w:p>
+      <w:pPr>
+        <w:pStyle w:val="abstract-label"/>
+        <w:rPr>
+          <w:rFonts w:ascii="Cambria" w:hAnsi="Cambria"/>
+          <w:lang w:val="en"/>
+        </w:rPr>
+      </w:pPr>
+      <w:r>
+        <w:rPr>
+          <w:rFonts w:ascii="Cambria" w:hAnsi="Cambria"/>
+          <w:lang w:val="en"/>
+        </w:rPr>
+        <w:t>Abstract</w:t>
+      </w:r>
+    </w:p>
+    <w:p>
+      <w:pPr>
+        <w:pStyle w:val="abstract"/>
+        <w:rPr>
+          <w:rFonts w:ascii="Cambria" w:hAnsi="Cambria"/>
+          <w:color w:val="1C1C1C"/>
+          <w:lang w:val="en"/>
+        </w:rPr>
+      </w:pPr>
+      <w:r>
+        <w:rPr>
+          <w:rFonts w:ascii="Cambria" w:hAnsi="Cambria"/>
+          <w:color w:val="1C1C1C"/>
+          <w:lang w:val="en"/>
+        </w:rPr>
+        <w:t>English spelling takes children more than twice as long to learn as regular systems such as Italian, because the letters do not keep one sound. The International Phonetic Alphabet already writes the sounds, but most people will not use a new alphabet or a new keyboard. This paper proposes DoAc, short for dots and accents: the five familiar vowel letters, each with five kinds of Hungarian-style mark, giving 25 vowel signs. That is enough for the high British count of vowel phonemes. When two vowels are heard</w:t>
+      </w:r>
+      <w:r>
+        <w:rPr>
+          <w:rFonts w:ascii="Cambria" w:hAnsi="Cambria"/>
+          <w:color w:val="1C1C1C"/>
+          <w:lang w:val="en"/>
+        </w:rPr>
+        <w:t xml:space="preserve">, as in </w:t>
+      </w:r>
+      <w:r>
+        <w:rPr>
+          <w:rFonts w:ascii="Cambria" w:hAnsi="Cambria"/>
+          <w:i/>
+          <w:iCs/>
+          <w:color w:val="1C1C1C"/>
+          <w:lang w:val="en"/>
+        </w:rPr>
+        <w:t>night</w:t>
+      </w:r>
+      <w:r>
+        <w:rPr>
+          <w:rFonts w:ascii="Cambria" w:hAnsi="Cambria"/>
+          <w:color w:val="1C1C1C"/>
+          <w:lang w:val="en"/>
+        </w:rPr>
+        <w:t>, they are written as two letters (</w:t>
+      </w:r>
+      <w:r>
+        <w:rPr>
+          <w:rFonts w:ascii="Cambria" w:hAnsi="Cambria"/>
+          <w:i/>
+          <w:iCs/>
+          <w:color w:val="1C1C1C"/>
+          <w:lang w:val="en"/>
+        </w:rPr>
+        <w:t>nait</w:t>
+      </w:r>
+      <w:r>
+        <w:rPr>
+          <w:rFonts w:ascii="Cambria" w:hAnsi="Cambria"/>
+          <w:color w:val="1C1C1C"/>
+          <w:lang w:val="en"/>
+        </w:rPr>
+        <w:t xml:space="preserve">). If an </w:t>
+      </w:r>
+      <w:r>
+        <w:rPr>
+          <w:rFonts w:ascii="Cambria" w:hAnsi="Cambria"/>
+          <w:i/>
+          <w:iCs/>
+          <w:color w:val="1C1C1C"/>
+          <w:lang w:val="en"/>
+        </w:rPr>
+        <w:t>r</w:t>
+      </w:r>
+      <w:r>
+        <w:rPr>
+          <w:rFonts w:ascii="Cambria" w:hAnsi="Cambria"/>
+          <w:color w:val="1C1C1C"/>
+          <w:lang w:val="en"/>
+        </w:rPr>
+        <w:t xml:space="preserve"> is heard, it is written. The palatal glide is written </w:t>
+      </w:r>
+      <w:r>
+        <w:rPr>
+          <w:rFonts w:ascii="Cambria" w:hAnsi="Cambria"/>
+          <w:i/>
+          <w:iCs/>
+          <w:color w:val="1C1C1C"/>
+          <w:lang w:val="en"/>
+        </w:rPr>
+        <w:t>i</w:t>
+      </w:r>
+      <w:r>
+        <w:rPr>
+          <w:rFonts w:ascii="Cambria" w:hAnsi="Cambria"/>
+          <w:color w:val="1C1C1C"/>
+          <w:lang w:val="en"/>
+        </w:rPr>
+        <w:t xml:space="preserve"> (</w:t>
+      </w:r>
+      <w:r>
+        <w:rPr>
+          <w:rFonts w:ascii="Cambria" w:hAnsi="Cambria"/>
+          <w:i/>
+          <w:iCs/>
+          <w:color w:val="1C1C1C"/>
+          <w:lang w:val="en"/>
+        </w:rPr>
+        <w:t>yes</w:t>
+      </w:r>
+      <w:r>
+        <w:rPr>
+          <w:rFonts w:ascii="Cambria" w:hAnsi="Cambria"/>
+          <w:color w:val="1C1C1C"/>
+          <w:lang w:val="en"/>
+        </w:rPr>
+        <w:t xml:space="preserve"> is </w:t>
+      </w:r>
+      <w:r>
+        <w:rPr>
+          <w:rFonts w:ascii="Cambria" w:hAnsi="Cambria"/>
+          <w:i/>
+          <w:iCs/>
+          <w:color w:val="1C1C1C"/>
+          <w:lang w:val="en"/>
+        </w:rPr>
+        <w:t>ies</w:t>
+      </w:r>
+      <w:r>
+        <w:rPr>
+          <w:rFonts w:ascii="Cambria" w:hAnsi="Cambria"/>
+          <w:color w:val="1C1C1C"/>
+          <w:lang w:val="en"/>
+        </w:rPr>
+        <w:t xml:space="preserve">, </w:t>
+      </w:r>
+      <w:r>
+        <w:rPr>
+          <w:rFonts w:ascii="Cambria" w:hAnsi="Cambria"/>
+          <w:i/>
+          <w:iCs/>
+          <w:color w:val="1C1C1C"/>
+          <w:lang w:val="en"/>
+        </w:rPr>
+        <w:t>yacht</w:t>
+      </w:r>
+      <w:r>
+        <w:rPr>
+          <w:rFonts w:ascii="Cambria" w:hAnsi="Cambria"/>
+          <w:color w:val="1C1C1C"/>
+          <w:lang w:val="en"/>
+        </w:rPr>
+        <w:t xml:space="preserve"> is </w:t>
+      </w:r>
+      <w:r>
+        <w:rPr>
+          <w:rFonts w:ascii="Cambria" w:hAnsi="Cambria"/>
+          <w:i/>
+          <w:iCs/>
+          <w:color w:val="1C1C1C"/>
+          <w:lang w:val="en"/>
+        </w:rPr>
+        <w:t>iát</w:t>
+      </w:r>
+      <w:r>
+        <w:rPr>
+          <w:rFonts w:ascii="Cambria" w:hAnsi="Cambria"/>
+          <w:color w:val="1C1C1C"/>
+          <w:lang w:val="en"/>
+        </w:rPr>
+        <w:t xml:space="preserve">, </w:t>
+      </w:r>
+      <w:r>
+        <w:rPr>
+          <w:rFonts w:ascii="Cambria" w:hAnsi="Cambria"/>
+          <w:i/>
+          <w:iCs/>
+          <w:color w:val="1C1C1C"/>
+          <w:lang w:val="en"/>
+        </w:rPr>
+        <w:t>queue</w:t>
+      </w:r>
+      <w:r>
+        <w:rPr>
+          <w:rFonts w:ascii="Cambria" w:hAnsi="Cambria"/>
+          <w:color w:val="1C1C1C"/>
+          <w:lang w:val="en"/>
+        </w:rPr>
+        <w:t xml:space="preserve"> is </w:t>
+      </w:r>
+      <w:r>
+        <w:rPr>
+          <w:rFonts w:ascii="Cambria" w:hAnsi="Cambria"/>
+          <w:i/>
+          <w:iCs/>
+          <w:color w:val="1C1C1C"/>
+          <w:lang w:val="en"/>
+        </w:rPr>
+        <w:t>kiú</w:t>
+      </w:r>
+      <w:r>
+        <w:rPr>
+          <w:rFonts w:ascii="Cambria" w:hAnsi="Cambria"/>
+          <w:color w:val="1C1C1C"/>
+          <w:lang w:val="en"/>
+        </w:rPr>
+        <w:t>). Unmarked vowels may be used for speed, but they are formally incomplete. Earlier reforms left the Latin alphabet, ran out of vowel signs, changed too little, or made children learn two systems. DoAc is a capacity argument and a working map, not a teaching trial.</w:t>
       </w:r>
     </w:p>
     <w:p>
@@ -386,7 +608,16 @@
           <w:color w:val="1C1C1C"/>
           <w:lang w:val="en"/>
         </w:rPr>
-        <w:t xml:space="preserve">, short for dots and accents. Five vowel letters times five kinds of mark give 25 vowel signs. That is enough for the vowel sounds of English. When two vowels are heard in a row, as in </w:t>
+        <w:t xml:space="preserve">, </w:t>
+      </w:r>
+      <w:r>
+        <w:rPr>
+          <w:rFonts w:ascii="Cambria" w:hAnsi="Cambria"/>
+          <w:color w:val="1C1C1C"/>
+          <w:lang w:val="en"/>
+        </w:rPr>
+        <w:lastRenderedPageBreak/>
+        <w:t xml:space="preserve">short for dots and accents. Five vowel letters times five kinds of mark give 25 vowel signs. That is enough for the vowel sounds of English. When two vowels are heard in a row, as in </w:t>
       </w:r>
       <w:r>
         <w:rPr>
@@ -474,7 +705,6 @@
           <w:color w:val="1C1C1C"/>
           <w:lang w:val="en"/>
         </w:rPr>
-        <w:lastRenderedPageBreak/>
         <w:t xml:space="preserve">English has many more vowel sounds than vowel letters. A standard account gives about 20–25 vowel phonemes in Received Pronunciation, 14–16 in General American, and 19–21 in Australian English (Roach, 2004; Wells, 1982; see also the summary in Crystal, 2003). Some of the extra sounds are two vowels said one after the other, such as the sound in </w:t>
       </w:r>
       <w:r>
@@ -755,6 +985,7 @@
                 <w:sz w:val="22"/>
                 <w:szCs w:val="22"/>
               </w:rPr>
+              <w:lastRenderedPageBreak/>
               <w:t>no mark</w:t>
             </w:r>
           </w:p>
@@ -985,7 +1216,6 @@
                 <w:sz w:val="22"/>
                 <w:szCs w:val="22"/>
               </w:rPr>
-              <w:lastRenderedPageBreak/>
               <w:t>two accents</w:t>
             </w:r>
           </w:p>
@@ -1118,7 +1348,15 @@
           <w:color w:val="1C1C1C"/>
           <w:lang w:val="en"/>
         </w:rPr>
-        <w:t xml:space="preserve"> can be long. English may not need every cell. The point of the grid is that the familiar five vowel letters, plus marks already used in Latin-script languages, are not short of signs. People do not need a new alphabet in order to have 25 vowel symbols.</w:t>
+        <w:t xml:space="preserve"> </w:t>
+      </w:r>
+      <w:r>
+        <w:rPr>
+          <w:rFonts w:ascii="Cambria" w:hAnsi="Cambria"/>
+          <w:color w:val="1C1C1C"/>
+          <w:lang w:val="en"/>
+        </w:rPr>
+        <w:t>can be long. English may not need every cell. The point of the grid is that the familiar five vowel letters, plus marks already used in Latin-script languages, are not short of signs. People do not need a new alphabet in order to have 25 vowel symbols.</w:t>
       </w:r>
     </w:p>
     <w:p>
@@ -1998,7 +2236,15 @@
           <w:color w:val="1C1C1C"/>
           <w:lang w:val="en"/>
         </w:rPr>
-        <w:t xml:space="preserve"> is not needed beside </w:t>
+        <w:t xml:space="preserve"> </w:t>
+      </w:r>
+      <w:r>
+        <w:rPr>
+          <w:rFonts w:ascii="Cambria" w:hAnsi="Cambria"/>
+          <w:color w:val="1C1C1C"/>
+          <w:lang w:val="en"/>
+        </w:rPr>
+        <w:t xml:space="preserve">is not needed beside </w:t>
       </w:r>
       <w:r>
         <w:rPr>
@@ -2052,15 +2298,7 @@
           <w:color w:val="1C1C1C"/>
           <w:lang w:val="en"/>
         </w:rPr>
-        <w:t xml:space="preserve">. None of this is new. Cut Spelling </w:t>
-      </w:r>
-      <w:r>
-        <w:rPr>
-          <w:rFonts w:ascii="Cambria" w:hAnsi="Cambria"/>
-          <w:color w:val="1C1C1C"/>
-          <w:lang w:val="en"/>
-        </w:rPr>
-        <w:t>and New Spelling already cut silent letters. The hard part, and the part those systems still under-supply, is the vowels.</w:t>
+        <w:t>. None of this is new. Cut Spelling and New Spelling already cut silent letters. The hard part, and the part those systems still under-supply, is the vowels.</w:t>
       </w:r>
     </w:p>
     <w:tbl>
@@ -4984,7 +5222,7 @@
       <w:pPr>
         <w:pStyle w:val="label1"/>
         <w:shd w:val="clear" w:color="auto" w:fill="F6F1EA"/>
-        <w:divId w:val="1563520031"/>
+        <w:divId w:val="1411922651"/>
         <w:rPr>
           <w:rFonts w:ascii="Cambria" w:hAnsi="Cambria"/>
           <w:lang w:val="en"/>
@@ -5002,7 +5240,7 @@
       <w:pPr>
         <w:pStyle w:val="ord1"/>
         <w:shd w:val="clear" w:color="auto" w:fill="F6F1EA"/>
-        <w:divId w:val="1563520031"/>
+        <w:divId w:val="1411922651"/>
         <w:rPr>
           <w:rFonts w:ascii="Cambria" w:hAnsi="Cambria"/>
           <w:color w:val="1C1C1C"/>
@@ -5022,7 +5260,7 @@
       <w:pPr>
         <w:pStyle w:val="doac1"/>
         <w:shd w:val="clear" w:color="auto" w:fill="F6F1EA"/>
-        <w:divId w:val="1563520031"/>
+        <w:divId w:val="1411922651"/>
         <w:rPr>
           <w:rFonts w:ascii="Cambria" w:hAnsi="Cambria"/>
           <w:lang w:val="en"/>
@@ -5058,7 +5296,7 @@
       <w:pPr>
         <w:pStyle w:val="label1"/>
         <w:shd w:val="clear" w:color="auto" w:fill="F6F1EA"/>
-        <w:divId w:val="452599816"/>
+        <w:divId w:val="1973096756"/>
         <w:rPr>
           <w:rFonts w:ascii="Cambria" w:hAnsi="Cambria"/>
           <w:lang w:val="en"/>
@@ -5076,7 +5314,7 @@
       <w:pPr>
         <w:pStyle w:val="ord1"/>
         <w:shd w:val="clear" w:color="auto" w:fill="F6F1EA"/>
-        <w:divId w:val="452599816"/>
+        <w:divId w:val="1973096756"/>
         <w:rPr>
           <w:rFonts w:ascii="Cambria" w:hAnsi="Cambria"/>
           <w:color w:val="1C1C1C"/>
@@ -5096,7 +5334,7 @@
       <w:pPr>
         <w:pStyle w:val="doac1"/>
         <w:shd w:val="clear" w:color="auto" w:fill="F6F1EA"/>
-        <w:divId w:val="452599816"/>
+        <w:divId w:val="1973096756"/>
         <w:rPr>
           <w:rFonts w:ascii="Cambria" w:hAnsi="Cambria"/>
           <w:lang w:val="en"/>
@@ -6088,7 +6326,7 @@
       <w:pPr>
         <w:pStyle w:val="label1"/>
         <w:shd w:val="clear" w:color="auto" w:fill="F6F1EA"/>
-        <w:divId w:val="243731144"/>
+        <w:divId w:val="1618678735"/>
         <w:rPr>
           <w:rFonts w:ascii="Cambria" w:hAnsi="Cambria"/>
           <w:lang w:val="en"/>
@@ -6106,7 +6344,7 @@
       <w:pPr>
         <w:pStyle w:val="ord1"/>
         <w:shd w:val="clear" w:color="auto" w:fill="F6F1EA"/>
-        <w:divId w:val="243731144"/>
+        <w:divId w:val="1618678735"/>
         <w:rPr>
           <w:rFonts w:ascii="Cambria" w:hAnsi="Cambria"/>
           <w:color w:val="1C1C1C"/>
@@ -6126,7 +6364,7 @@
       <w:pPr>
         <w:pStyle w:val="doac1"/>
         <w:shd w:val="clear" w:color="auto" w:fill="F6F1EA"/>
-        <w:divId w:val="243731144"/>
+        <w:divId w:val="1618678735"/>
         <w:rPr>
           <w:rFonts w:ascii="Cambria" w:hAnsi="Cambria"/>
           <w:lang w:val="en"/>
@@ -6515,15 +6753,7 @@
           <w:color w:val="1C1C1C"/>
           <w:lang w:val="en"/>
         </w:rPr>
-        <w:t xml:space="preserve"> </w:t>
-      </w:r>
-      <w:r>
-        <w:rPr>
-          <w:rFonts w:ascii="Cambria" w:hAnsi="Cambria"/>
-          <w:color w:val="1C1C1C"/>
-          <w:lang w:val="en"/>
-        </w:rPr>
-        <w:t xml:space="preserve">(Crystal, 2012). The joke works only because the same letters change sound from word to word. If each letter had one sound, </w:t>
+        <w:t xml:space="preserve"> (Crystal, 2012). The joke works only because the same letters change sound from word to word. If each letter had one sound, </w:t>
       </w:r>
       <w:r>
         <w:rPr>
@@ -6900,60 +7130,6 @@
           <w:lang w:val="en"/>
         </w:rPr>
         <w:t>So the old attempts miss at least one of these: they leave the Latin alphabet, they do not have enough vowel signs, they change too little, or they make children learn two systems. DoAc keeps the familiar letters, adds marks so there are enough vowel signs, and is one system, not two.</w:t>
-      </w:r>
-    </w:p>
-    <w:p>
-      <w:pPr>
-        <w:pStyle w:val="NormalWeb"/>
-        <w:rPr>
-          <w:rFonts w:ascii="Cambria" w:hAnsi="Cambria"/>
-          <w:color w:val="1C1C1C"/>
-          <w:lang w:val="en"/>
-        </w:rPr>
-      </w:pPr>
-      <w:r>
-        <w:rPr>
-          <w:rFonts w:ascii="Cambria" w:hAnsi="Cambria"/>
-          <w:color w:val="1C1C1C"/>
-          <w:lang w:val="en"/>
-        </w:rPr>
-        <w:t xml:space="preserve">The answers in Table 2 are written in DoAc: </w:t>
-      </w:r>
-      <w:r>
-        <w:rPr>
-          <w:rFonts w:ascii="Cambria" w:hAnsi="Cambria"/>
-          <w:i/>
-          <w:iCs/>
-          <w:color w:val="1C1C1C"/>
-          <w:lang w:val="en"/>
-        </w:rPr>
-        <w:t>ies</w:t>
-      </w:r>
-      <w:r>
-        <w:rPr>
-          <w:rFonts w:ascii="Cambria" w:hAnsi="Cambria"/>
-          <w:color w:val="1C1C1C"/>
-          <w:lang w:val="en"/>
-        </w:rPr>
-        <w:t xml:space="preserve"> for </w:t>
-      </w:r>
-      <w:r>
-        <w:rPr>
-          <w:rFonts w:ascii="Cambria" w:hAnsi="Cambria"/>
-          <w:i/>
-          <w:iCs/>
-          <w:color w:val="1C1C1C"/>
-          <w:lang w:val="en"/>
-        </w:rPr>
-        <w:t>yes</w:t>
-      </w:r>
-      <w:r>
-        <w:rPr>
-          <w:rFonts w:ascii="Cambria" w:hAnsi="Cambria"/>
-          <w:color w:val="1C1C1C"/>
-          <w:lang w:val="en"/>
-        </w:rPr>
-        <w:t>.</w:t>
       </w:r>
     </w:p>
     <w:tbl>
@@ -7183,7 +7359,7 @@
                 <w:sz w:val="22"/>
                 <w:szCs w:val="22"/>
               </w:rPr>
-              <w:t>ies</w:t>
+              <w:t>yes</w:t>
             </w:r>
           </w:p>
         </w:tc>
@@ -7243,7 +7419,7 @@
                 <w:sz w:val="22"/>
                 <w:szCs w:val="22"/>
               </w:rPr>
-              <w:t>ies</w:t>
+              <w:t>yes</w:t>
             </w:r>
           </w:p>
         </w:tc>
@@ -7336,7 +7512,7 @@
                 <w:sz w:val="22"/>
                 <w:szCs w:val="22"/>
               </w:rPr>
-              <w:t>ies</w:t>
+              <w:t>yes</w:t>
             </w:r>
           </w:p>
         </w:tc>
@@ -7362,7 +7538,7 @@
                 <w:sz w:val="22"/>
                 <w:szCs w:val="22"/>
               </w:rPr>
-              <w:t>ies, if adopted</w:t>
+              <w:t>yes, if adopted</w:t>
             </w:r>
           </w:p>
         </w:tc>
@@ -7450,7 +7626,7 @@
                 <w:sz w:val="22"/>
                 <w:szCs w:val="22"/>
               </w:rPr>
-              <w:t>ies</w:t>
+              <w:t>yes</w:t>
             </w:r>
           </w:p>
         </w:tc>
@@ -7543,7 +7719,7 @@
                 <w:sz w:val="22"/>
                 <w:szCs w:val="22"/>
               </w:rPr>
-              <w:t>ies</w:t>
+              <w:t>yes</w:t>
             </w:r>
           </w:p>
         </w:tc>
@@ -7603,7 +7779,7 @@
                 <w:sz w:val="22"/>
                 <w:szCs w:val="22"/>
               </w:rPr>
-              <w:t>ies</w:t>
+              <w:t>yes</w:t>
             </w:r>
           </w:p>
         </w:tc>
@@ -7665,7 +7841,7 @@
                 <w:sz w:val="22"/>
                 <w:szCs w:val="22"/>
               </w:rPr>
-              <w:t>ies</w:t>
+              <w:t>yes</w:t>
             </w:r>
           </w:p>
         </w:tc>
@@ -7695,7 +7871,7 @@
                 <w:sz w:val="22"/>
                 <w:szCs w:val="22"/>
               </w:rPr>
-              <w:t>ies</w:t>
+              <w:t>yes</w:t>
             </w:r>
           </w:p>
         </w:tc>
@@ -7725,7 +7901,7 @@
                 <w:sz w:val="22"/>
                 <w:szCs w:val="22"/>
               </w:rPr>
-              <w:t>ies</w:t>
+              <w:t>yes</w:t>
             </w:r>
           </w:p>
         </w:tc>
@@ -8298,7 +8474,7 @@
           <w:color w:val="1C1C1C"/>
           <w:lang w:val="en"/>
         </w:rPr>
-        <w:pict w14:anchorId="0C47BFE0">
+        <w:pict w14:anchorId="6EB1D0C8">
           <v:rect id="_x0000_i1026" style="width:0;height:1.5pt" o:hralign="center" o:hrstd="t" o:hr="t" fillcolor="#a0a0a0" stroked="f"/>
         </w:pict>
       </w:r>
@@ -9003,7 +9179,7 @@
       <w:pPr>
         <w:pStyle w:val="NormalWeb"/>
         <w:shd w:val="clear" w:color="auto" w:fill="F4F7F9"/>
-        <w:divId w:val="1832212412"/>
+        <w:divId w:val="2029941145"/>
         <w:rPr>
           <w:rFonts w:ascii="Cambria" w:hAnsi="Cambria"/>
           <w:color w:val="1C1C1C"/>
@@ -9640,6 +9816,32 @@
       <w:szCs w:val="21"/>
     </w:rPr>
   </w:style>
+  <w:style w:type="paragraph" w:customStyle="1" w:styleId="abstract-label">
+    <w:name w:val="abstract-label"/>
+    <w:basedOn w:val="Normal"/>
+    <w:pPr>
+      <w:spacing w:before="320" w:after="120"/>
+    </w:pPr>
+    <w:rPr>
+      <w:caps/>
+      <w:color w:val="8A4B24"/>
+      <w:spacing w:val="34"/>
+      <w:sz w:val="19"/>
+      <w:szCs w:val="19"/>
+    </w:rPr>
+  </w:style>
+  <w:style w:type="paragraph" w:customStyle="1" w:styleId="abstract">
+    <w:name w:val="abstract"/>
+    <w:basedOn w:val="Normal"/>
+    <w:pPr>
+      <w:shd w:val="clear" w:color="auto" w:fill="F4F7F9"/>
+      <w:spacing w:after="200"/>
+    </w:pPr>
+    <w:rPr>
+      <w:sz w:val="22"/>
+      <w:szCs w:val="22"/>
+    </w:rPr>
+  </w:style>
   <w:style w:type="paragraph" w:customStyle="1" w:styleId="kit">
     <w:name w:val="kit"/>
     <w:basedOn w:val="Normal"/>
@@ -9810,7 +10012,7 @@
     <w:basedOn w:val="TableauNormal"/>
     <w:uiPriority w:val="68"/>
     <w:unhideWhenUsed/>
-    <w:rsid w:val="00D85A52"/>
+    <w:rsid w:val="000A276E"/>
     <w:rPr>
       <w:rFonts w:asciiTheme="majorHAnsi" w:eastAsiaTheme="majorEastAsia" w:hAnsiTheme="majorHAnsi" w:cstheme="majorBidi"/>
       <w:color w:val="000000" w:themeColor="text1"/>

</xml_diff>